<commit_message>
Livraison v0.4 du 07 juin 2026 [KoboConnect + View Transposition + User Manager]
</commit_message>
<xml_diff>
--- a/KBase-docs/NOTE_TECHNIQUE_10_GESTION_UTILISATEURS_FERMEE_G2M.docx
+++ b/KBase-docs/NOTE_TECHNIQUE_10_GESTION_UTILISATEURS_FERMEE_G2M.docx
@@ -25,13 +25,7 @@
         <w:spacing w:after="130"/>
       </w:pPr>
       <w:r>
-        <w:t>Cette note technique décrit une proposition d'implémentation progressive d'</w:t>
-      </w:r>
-      <w:r>
-        <w:t>un système de gestion fermée des utilisateurs pour G2M. Le principe retenu est le suivant : aucun utilisateur ne peut s'inscrire librement. Un compte ne peut être activé que si un administrateur a préalablement créé une invitation valide pour l'adresse ema</w:t>
-      </w:r>
-      <w:r>
-        <w:t>il concernée.</w:t>
+        <w:t>Cette note technique décrit une proposition d'implémentation progressive d'un système de gestion fermée des utilisateurs pour G2M. Le principe retenu est le suivant : aucun utilisateur ne peut s'inscrire librement. Un compte ne peut être activé que si un administrateur a préalablement créé une invitation valide pour l'adresse email concernée.</w:t>
       </w:r>
     </w:p>
     <w:p>
@@ -91,10 +85,7 @@
         <w:spacing w:after="130"/>
       </w:pPr>
       <w:r>
-        <w:t>le hachage</w:t>
-      </w:r>
-      <w:r>
-        <w:t xml:space="preserve"> sécurisé du mot de passe ;</w:t>
+        <w:t>le hachage sécurisé du mot de passe ;</w:t>
       </w:r>
     </w:p>
     <w:p>
@@ -177,10 +168,7 @@
         <w:spacing w:before="260" w:after="140"/>
       </w:pPr>
       <w:r>
-        <w:t>2.1. Structure actuelle</w:t>
-      </w:r>
-      <w:r>
-        <w:t xml:space="preserve"> observée</w:t>
+        <w:t>2.1. Structure actuelle observée</w:t>
       </w:r>
     </w:p>
     <w:p>
@@ -654,14 +642,7 @@
                 <w:rFonts w:ascii="Courier New" w:eastAsia="Courier New" w:hAnsi="Courier New" w:cs="Courier New"/>
                 <w:shd w:val="clear" w:color="auto" w:fill="E9EEF2"/>
               </w:rPr>
-              <w:t>vie</w:t>
-            </w:r>
-            <w:r>
-              <w:rPr>
-                <w:rFonts w:ascii="Courier New" w:eastAsia="Courier New" w:hAnsi="Courier New" w:cs="Courier New"/>
-                <w:shd w:val="clear" w:color="auto" w:fill="E9EEF2"/>
-              </w:rPr>
-              <w:t>ws</w:t>
+              <w:t>views</w:t>
             </w:r>
             <w:proofErr w:type="spellEnd"/>
             <w:r>
@@ -1023,10 +1004,7 @@
         <w:spacing w:after="130"/>
       </w:pPr>
       <w:r>
-        <w:t>La tab</w:t>
-      </w:r>
-      <w:r>
-        <w:t xml:space="preserve">le </w:t>
+        <w:t xml:space="preserve">La table </w:t>
       </w:r>
       <w:proofErr w:type="spellStart"/>
       <w:r>
@@ -1622,10 +1600,7 @@
         <w:spacing w:after="130"/>
       </w:pPr>
       <w:r>
-        <w:t>hab</w:t>
-      </w:r>
-      <w:r>
-        <w:t>ilitations par rôle ou par utilisateur ;</w:t>
+        <w:t>habilitations par rôle ou par utilisateur ;</w:t>
       </w:r>
     </w:p>
     <w:p>
@@ -1784,10 +1759,7 @@
       </w:r>
       <w:proofErr w:type="spellEnd"/>
       <w:r>
-        <w:t xml:space="preserve"> en évitant les pa</w:t>
-      </w:r>
-      <w:r>
-        <w:t xml:space="preserve">rticularités </w:t>
+        <w:t xml:space="preserve"> en évitant les particularités </w:t>
       </w:r>
       <w:proofErr w:type="spellStart"/>
       <w:r>
@@ -1861,10 +1833,7 @@
         <w:spacing w:after="130"/>
       </w:pPr>
       <w:r>
-        <w:t>Étendre le sch</w:t>
-      </w:r>
-      <w:r>
-        <w:t xml:space="preserve">éma </w:t>
+        <w:t xml:space="preserve">Étendre le schéma </w:t>
       </w:r>
       <w:proofErr w:type="spellStart"/>
       <w:r>
@@ -1980,10 +1949,7 @@
         <w:spacing w:after="130"/>
       </w:pPr>
       <w:r>
-        <w:t>Ajouter le parcours publi</w:t>
-      </w:r>
-      <w:r>
-        <w:t>c d'activation.</w:t>
+        <w:t>Ajouter le parcours public d'activation.</w:t>
       </w:r>
     </w:p>
     <w:p>
@@ -2148,15 +2114,7 @@
           <w:sz w:val="18"/>
           <w:szCs w:val="18"/>
         </w:rPr>
-        <w:t xml:space="preserve"> TEXT,</w:t>
-      </w:r>
-      <w:r>
-        <w:rPr>
-          <w:rFonts w:ascii="Courier New" w:eastAsia="Courier New" w:hAnsi="Courier New" w:cs="Courier New"/>
-          <w:sz w:val="18"/>
-          <w:szCs w:val="18"/>
-        </w:rPr>
-        <w:t xml:space="preserve">   </w:t>
+        <w:t xml:space="preserve"> TEXT,   </w:t>
       </w:r>
       <w:proofErr w:type="spellStart"/>
       <w:r>
@@ -2264,15 +2222,7 @@
           <w:sz w:val="18"/>
           <w:szCs w:val="18"/>
         </w:rPr>
-        <w:t xml:space="preserve"> INTEGER NOT NULL D</w:t>
-      </w:r>
-      <w:r>
-        <w:rPr>
-          <w:rFonts w:ascii="Courier New" w:eastAsia="Courier New" w:hAnsi="Courier New" w:cs="Courier New"/>
-          <w:sz w:val="18"/>
-          <w:szCs w:val="18"/>
-        </w:rPr>
-        <w:t xml:space="preserve">EFAULT 0,   </w:t>
+        <w:t xml:space="preserve"> INTEGER NOT NULL DEFAULT 0,   </w:t>
       </w:r>
       <w:proofErr w:type="spellStart"/>
       <w:r>
@@ -2428,10 +2378,7 @@
         <w:spacing w:after="130"/>
       </w:pPr>
       <w:r>
-        <w:t xml:space="preserve">Cette </w:t>
-      </w:r>
-      <w:r>
-        <w:t>table porte l'invitation administrative.</w:t>
+        <w:t>Cette table porte l'invitation administrative.</w:t>
       </w:r>
     </w:p>
     <w:p>
@@ -2527,15 +2474,7 @@
           <w:sz w:val="18"/>
           <w:szCs w:val="18"/>
         </w:rPr>
-        <w:t>mis</w:t>
-      </w:r>
-      <w:r>
-        <w:rPr>
-          <w:rFonts w:ascii="Courier New" w:eastAsia="Courier New" w:hAnsi="Courier New" w:cs="Courier New"/>
-          <w:sz w:val="18"/>
-          <w:szCs w:val="18"/>
-        </w:rPr>
-        <w:t>sion_id</w:t>
+        <w:t>mission_id</w:t>
       </w:r>
       <w:proofErr w:type="spellEnd"/>
       <w:r>
@@ -2688,15 +2627,7 @@
           <w:sz w:val="18"/>
           <w:szCs w:val="18"/>
         </w:rPr>
-        <w:t xml:space="preserve"> TEXT NOT </w:t>
-      </w:r>
-      <w:r>
-        <w:rPr>
-          <w:rFonts w:ascii="Courier New" w:eastAsia="Courier New" w:hAnsi="Courier New" w:cs="Courier New"/>
-          <w:sz w:val="18"/>
-          <w:szCs w:val="18"/>
-        </w:rPr>
-        <w:t xml:space="preserve">NULL DEFAULT CURRENT_TIMESTAMP,   </w:t>
+        <w:t xml:space="preserve"> TEXT NOT NULL DEFAULT CURRENT_TIMESTAMP,   </w:t>
       </w:r>
       <w:proofErr w:type="spellStart"/>
       <w:r>
@@ -2768,15 +2699,7 @@
           <w:sz w:val="18"/>
           <w:szCs w:val="18"/>
         </w:rPr>
-        <w:t xml:space="preserve">(id)     ON UPDATE CASCADE    </w:t>
-      </w:r>
-      <w:r>
-        <w:rPr>
-          <w:rFonts w:ascii="Courier New" w:eastAsia="Courier New" w:hAnsi="Courier New" w:cs="Courier New"/>
-          <w:sz w:val="18"/>
-          <w:szCs w:val="18"/>
-        </w:rPr>
-        <w:t xml:space="preserve"> ON DELETE SET NULL );</w:t>
+        <w:t>(id)     ON UPDATE CASCADE     ON DELETE SET NULL );</w:t>
       </w:r>
     </w:p>
     <w:p>
@@ -2822,10 +2745,7 @@
       </w:r>
       <w:proofErr w:type="spellEnd"/>
       <w:r>
-        <w:t>, mais elle prépare mieux les usages futurs : renouvellement, expiration, rév</w:t>
-      </w:r>
-      <w:r>
-        <w:t xml:space="preserve">ocation, reset </w:t>
+        <w:t xml:space="preserve">, mais elle prépare mieux les usages futurs : renouvellement, expiration, révocation, reset </w:t>
       </w:r>
       <w:proofErr w:type="spellStart"/>
       <w:r>
@@ -2956,15 +2876,7 @@
           <w:sz w:val="18"/>
           <w:szCs w:val="18"/>
         </w:rPr>
-        <w:t xml:space="preserve"> IN ('a</w:t>
-      </w:r>
-      <w:r>
-        <w:rPr>
-          <w:rFonts w:ascii="Courier New" w:eastAsia="Courier New" w:hAnsi="Courier New" w:cs="Courier New"/>
-          <w:sz w:val="18"/>
-          <w:szCs w:val="18"/>
-        </w:rPr>
-        <w:t>ctivation', '</w:t>
+        <w:t xml:space="preserve"> IN ('activation', '</w:t>
       </w:r>
       <w:proofErr w:type="spellStart"/>
       <w:r>
@@ -3081,15 +2993,7 @@
           <w:sz w:val="18"/>
           <w:szCs w:val="18"/>
         </w:rPr>
-        <w:t>user</w:t>
-      </w:r>
-      <w:r>
-        <w:rPr>
-          <w:rFonts w:ascii="Courier New" w:eastAsia="Courier New" w:hAnsi="Courier New" w:cs="Courier New"/>
-          <w:sz w:val="18"/>
-          <w:szCs w:val="18"/>
-        </w:rPr>
-        <w:t>_id</w:t>
+        <w:t>user_id</w:t>
       </w:r>
       <w:proofErr w:type="spellEnd"/>
       <w:r>
@@ -3166,10 +3070,7 @@
       </w:r>
       <w:proofErr w:type="spellEnd"/>
       <w:r>
-        <w:t xml:space="preserve"> seule, car elle pourra enregistrer les connexions, invitations, suspensions et modifications d'habilitati</w:t>
-      </w:r>
-      <w:r>
-        <w:t>ons.</w:t>
+        <w:t xml:space="preserve"> seule, car elle pourra enregistrer les connexions, invitations, suspensions et modifications d'habilitations.</w:t>
       </w:r>
     </w:p>
     <w:p>
@@ -3346,15 +3247,7 @@
           <w:sz w:val="18"/>
           <w:szCs w:val="18"/>
         </w:rPr>
-        <w:t xml:space="preserve"> </w:t>
-      </w:r>
-      <w:r>
-        <w:rPr>
-          <w:rFonts w:ascii="Courier New" w:eastAsia="Courier New" w:hAnsi="Courier New" w:cs="Courier New"/>
-          <w:sz w:val="18"/>
-          <w:szCs w:val="18"/>
-        </w:rPr>
-        <w:t>TEXT NOT NULL DEFAULT CURRENT_TIMESTAMP,   FOREIGN KEY (</w:t>
+        <w:t xml:space="preserve"> TEXT NOT NULL DEFAULT CURRENT_TIMESTAMP,   FOREIGN KEY (</w:t>
       </w:r>
       <w:proofErr w:type="spellStart"/>
       <w:r>
@@ -3445,10 +3338,7 @@
         <w:spacing w:before="260" w:after="140"/>
       </w:pPr>
       <w:r>
-        <w:t>3.5. Tables d'habi</w:t>
-      </w:r>
-      <w:r>
-        <w:t>litations</w:t>
+        <w:t>3.5. Tables d'habilitations</w:t>
       </w:r>
     </w:p>
     <w:p>
@@ -3516,15 +3406,7 @@
           <w:szCs w:val="18"/>
         </w:rPr>
         <w:lastRenderedPageBreak/>
-        <w:t xml:space="preserve">NULL DEFAULT </w:t>
-      </w:r>
-      <w:r>
-        <w:rPr>
-          <w:rFonts w:ascii="Courier New" w:eastAsia="Courier New" w:hAnsi="Courier New" w:cs="Courier New"/>
-          <w:sz w:val="18"/>
-          <w:szCs w:val="18"/>
-        </w:rPr>
-        <w:t xml:space="preserve">CURRENT_TIMESTAMP );  CREATE TABLE </w:t>
+        <w:t xml:space="preserve">NULL DEFAULT CURRENT_TIMESTAMP );  CREATE TABLE </w:t>
       </w:r>
       <w:proofErr w:type="spellStart"/>
       <w:r>
@@ -3659,15 +3541,7 @@
           <w:sz w:val="18"/>
           <w:szCs w:val="18"/>
         </w:rPr>
-        <w:t>pe</w:t>
-      </w:r>
-      <w:r>
-        <w:rPr>
-          <w:rFonts w:ascii="Courier New" w:eastAsia="Courier New" w:hAnsi="Courier New" w:cs="Courier New"/>
-          <w:sz w:val="18"/>
-          <w:szCs w:val="18"/>
-        </w:rPr>
-        <w:t>rmission_id</w:t>
+        <w:t>permission_id</w:t>
       </w:r>
       <w:proofErr w:type="spellEnd"/>
       <w:r>
@@ -3766,15 +3640,7 @@
           <w:sz w:val="18"/>
           <w:szCs w:val="18"/>
         </w:rPr>
-        <w:t xml:space="preserve"> TEXT NOT NULL DEFAULT CU</w:t>
-      </w:r>
-      <w:r>
-        <w:rPr>
-          <w:rFonts w:ascii="Courier New" w:eastAsia="Courier New" w:hAnsi="Courier New" w:cs="Courier New"/>
-          <w:sz w:val="18"/>
-          <w:szCs w:val="18"/>
-        </w:rPr>
-        <w:t>RRENT_TIMESTAMP,   PRIMARY KEY (</w:t>
+        <w:t xml:space="preserve"> TEXT NOT NULL DEFAULT CURRENT_TIMESTAMP,   PRIMARY KEY (</w:t>
       </w:r>
       <w:proofErr w:type="spellStart"/>
       <w:r>
@@ -3873,10 +3739,7 @@
         <w:spacing w:before="260" w:after="140"/>
       </w:pPr>
       <w:r>
-        <w:t xml:space="preserve">3.6. </w:t>
-      </w:r>
-      <w:r>
-        <w:t>Rôles cibles</w:t>
+        <w:t>3.6. Rôles cibles</w:t>
       </w:r>
     </w:p>
     <w:p>
@@ -4167,10 +4030,7 @@
         <w:spacing w:before="260" w:after="140"/>
       </w:pPr>
       <w:r>
-        <w:t>4. Étape 3 - Routes admi</w:t>
-      </w:r>
-      <w:r>
-        <w:t>nistrateur</w:t>
+        <w:t>4. Étape 3 - Routes administrateur</w:t>
       </w:r>
     </w:p>
     <w:p>
@@ -4498,15 +4358,7 @@
           <w:sz w:val="18"/>
           <w:szCs w:val="18"/>
         </w:rPr>
-        <w:t>"</w:t>
-      </w:r>
-      <w:r>
-        <w:rPr>
-          <w:rFonts w:ascii="Courier New" w:eastAsia="Courier New" w:hAnsi="Courier New" w:cs="Courier New"/>
-          <w:sz w:val="18"/>
-          <w:szCs w:val="18"/>
-        </w:rPr>
-        <w:t xml:space="preserve">), </w:t>
+        <w:t xml:space="preserve">"), </w:t>
       </w:r>
       <w:proofErr w:type="spellStart"/>
       <w:r>
@@ -4695,15 +4547,7 @@
           <w:sz w:val="18"/>
           <w:szCs w:val="18"/>
         </w:rPr>
-        <w:t>adminUserController.createIn</w:t>
-      </w:r>
-      <w:r>
-        <w:rPr>
-          <w:rFonts w:ascii="Courier New" w:eastAsia="Courier New" w:hAnsi="Courier New" w:cs="Courier New"/>
-          <w:sz w:val="18"/>
-          <w:szCs w:val="18"/>
-        </w:rPr>
-        <w:t>vitation</w:t>
+        <w:t>adminUserController.createInvitation</w:t>
       </w:r>
       <w:proofErr w:type="spellEnd"/>
       <w:r>
@@ -4919,15 +4763,7 @@
           <w:sz w:val="18"/>
           <w:szCs w:val="18"/>
         </w:rPr>
-        <w:t>route</w:t>
-      </w:r>
-      <w:r>
-        <w:rPr>
-          <w:rFonts w:ascii="Courier New" w:eastAsia="Courier New" w:hAnsi="Courier New" w:cs="Courier New"/>
-          <w:sz w:val="18"/>
-          <w:szCs w:val="18"/>
-        </w:rPr>
-        <w:t>r.post</w:t>
+        <w:t>router.post</w:t>
       </w:r>
       <w:proofErr w:type="spellEnd"/>
       <w:r>
@@ -5147,10 +4983,7 @@
         <w:spacing w:after="130"/>
       </w:pPr>
       <w:r>
-        <w:t>cons</w:t>
-      </w:r>
-      <w:r>
-        <w:t xml:space="preserve">erver </w:t>
+        <w:t xml:space="preserve">conserver </w:t>
       </w:r>
       <w:r>
         <w:rPr>
@@ -5273,10 +5106,7 @@
         <w:spacing w:before="260" w:after="140"/>
       </w:pPr>
       <w:r>
-        <w:t>5. Étape 4 - Activation ut</w:t>
-      </w:r>
-      <w:r>
-        <w:t>ilisateur</w:t>
+        <w:t>5. Étape 4 - Activation utilisateur</w:t>
       </w:r>
     </w:p>
     <w:p>
@@ -5353,10 +5183,7 @@
         <w:spacing w:after="130"/>
       </w:pPr>
       <w:r>
-        <w:t>G2M peut envoyer immédiatement un email d'invitation, ou attendre que l'utilisateur tente une première con</w:t>
-      </w:r>
-      <w:r>
-        <w:t>nexion.</w:t>
+        <w:t>G2M peut envoyer immédiatement un email d'invitation, ou attendre que l'utilisateur tente une première connexion.</w:t>
       </w:r>
     </w:p>
     <w:p>
@@ -5397,15 +5224,7 @@
           <w:sz w:val="18"/>
           <w:szCs w:val="18"/>
         </w:rPr>
-        <w:t>https://g2m.example.org/</w:t>
-      </w:r>
-      <w:r>
-        <w:rPr>
-          <w:rFonts w:ascii="Courier New" w:eastAsia="Courier New" w:hAnsi="Courier New" w:cs="Courier New"/>
-          <w:sz w:val="18"/>
-          <w:szCs w:val="18"/>
-        </w:rPr>
-        <w:t>activation/&lt;token&gt;</w:t>
+        <w:t>https://g2m.example.org/activation/&lt;token&gt;</w:t>
       </w:r>
     </w:p>
     <w:p>
@@ -5604,10 +5423,7 @@
           </w:tcPr>
           <w:p>
             <w:r>
-              <w:t>Afficher un message sobre : "Si votre adresse est autorisée, un lien d'</w:t>
-            </w:r>
-            <w:r>
-              <w:t>activation ou de connexion vous sera envoyé." Aucun détail ne doit confirmer que l'email n'existe pas.</w:t>
+              <w:t>Afficher un message sobre : "Si votre adresse est autorisée, un lien d'activation ou de connexion vous sera envoyé." Aucun détail ne doit confirmer que l'email n'existe pas.</w:t>
             </w:r>
           </w:p>
         </w:tc>
@@ -5655,10 +5471,7 @@
             </w:r>
             <w:proofErr w:type="spellEnd"/>
             <w:r>
-              <w:t xml:space="preserve"> valide, envoyer l'email d'</w:t>
-            </w:r>
-            <w:r>
-              <w:t>activation, afficher un message sobre.</w:t>
+              <w:t xml:space="preserve"> valide, envoyer l'email d'activation, afficher un message sobre.</w:t>
             </w:r>
           </w:p>
         </w:tc>
@@ -5714,10 +5527,7 @@
           </w:tcPr>
           <w:p>
             <w:r>
-              <w:t>Procéder à la vérification classique du mot de pass</w:t>
-            </w:r>
-            <w:r>
-              <w:t>e.</w:t>
+              <w:t>Procéder à la vérification classique du mot de passe.</w:t>
             </w:r>
           </w:p>
         </w:tc>
@@ -5761,10 +5571,7 @@
         <w:spacing w:after="130"/>
       </w:pPr>
       <w:r>
-        <w:t>Ce mécanisme ne constitue pas une inscription ouverte. L'utilisateur ne peut recevoir un lien que si son email figure déjà dans une in</w:t>
-      </w:r>
-      <w:r>
-        <w:t>vitation valide créée par l'administrateur.</w:t>
+        <w:t>Ce mécanisme ne constitue pas une inscription ouverte. L'utilisateur ne peut recevoir un lien que si son email figure déjà dans une invitation valide créée par l'administrateur.</w:t>
       </w:r>
     </w:p>
     <w:p>
@@ -6014,10 +5821,7 @@
         <w:spacing w:after="130"/>
       </w:pPr>
       <w:r>
-        <w:t xml:space="preserve">mode production : envoyer le mail via </w:t>
-      </w:r>
-      <w:r>
-        <w:t>un fournisseur SMTP ou une API email.</w:t>
+        <w:t>mode production : envoyer le mail via un fournisseur SMTP ou une API email.</w:t>
       </w:r>
     </w:p>
     <w:p>
@@ -6065,17 +5869,7 @@
           <w:sz w:val="18"/>
           <w:szCs w:val="18"/>
         </w:rPr>
-        <w:t>MAIL_FROM=no-</w:t>
-      </w:r>
-      <w:bookmarkStart w:id="0" w:name="_GoBack"/>
-      <w:bookmarkEnd w:id="0"/>
-      <w:r>
-        <w:rPr>
-          <w:rFonts w:ascii="Courier New" w:eastAsia="Courier New" w:hAnsi="Courier New" w:cs="Courier New"/>
-          <w:sz w:val="18"/>
-          <w:szCs w:val="18"/>
-        </w:rPr>
-        <w:t>reply@g2m.example.org</w:t>
+        <w:t>MAIL_FROM=no-reply@g2m.example.org</w:t>
       </w:r>
       <w:r>
         <w:rPr>
@@ -6186,14 +5980,7 @@
           <w:rFonts w:ascii="Courier New" w:eastAsia="Courier New" w:hAnsi="Courier New" w:cs="Courier New"/>
           <w:shd w:val="clear" w:color="auto" w:fill="E9EEF2"/>
         </w:rPr>
-        <w:t>Activation de vo</w:t>
-      </w:r>
-      <w:r>
-        <w:rPr>
-          <w:rFonts w:ascii="Courier New" w:eastAsia="Courier New" w:hAnsi="Courier New" w:cs="Courier New"/>
-          <w:shd w:val="clear" w:color="auto" w:fill="E9EEF2"/>
-        </w:rPr>
-        <w:t>tre compte G2M</w:t>
+        <w:t>Activation de votre compte G2M</w:t>
       </w:r>
       <w:r>
         <w:t xml:space="preserve"> ;</w:t>
@@ -6299,10 +6086,7 @@
         <w:spacing w:after="130"/>
       </w:pPr>
       <w:r>
-        <w:t>il es</w:t>
-      </w:r>
-      <w:r>
-        <w:t>t expiré ;</w:t>
+        <w:t>il est expiré ;</w:t>
       </w:r>
     </w:p>
     <w:p>
@@ -6495,10 +6279,7 @@
       </w:r>
       <w:proofErr w:type="spellEnd"/>
       <w:r>
-        <w:t xml:space="preserve"> pour charger l'</w:t>
-      </w:r>
-      <w:r>
-        <w:t xml:space="preserve">utilisateur depuis le </w:t>
+        <w:t xml:space="preserve"> pour charger l'utilisateur depuis le </w:t>
       </w:r>
       <w:proofErr w:type="spellStart"/>
       <w:r>
@@ -6628,15 +6409,7 @@
           <w:sz w:val="18"/>
           <w:szCs w:val="18"/>
         </w:rPr>
-        <w:t>)</w:t>
-      </w:r>
-      <w:r>
-        <w:rPr>
-          <w:rFonts w:ascii="Courier New" w:eastAsia="Courier New" w:hAnsi="Courier New" w:cs="Courier New"/>
-          <w:sz w:val="18"/>
-          <w:szCs w:val="18"/>
-        </w:rPr>
-        <w:t xml:space="preserve">; </w:t>
+        <w:t xml:space="preserve">); </w:t>
       </w:r>
       <w:proofErr w:type="spellStart"/>
       <w:r>
@@ -6759,10 +6532,7 @@
         <w:spacing w:after="130"/>
       </w:pPr>
       <w:r>
-        <w:t>si une inv</w:t>
-      </w:r>
-      <w:r>
-        <w:t>itation valide existe, envoyer ou renvoyer un lien d'activation ;</w:t>
+        <w:t>si une invitation valide existe, envoyer ou renvoyer un lien d'activation ;</w:t>
       </w:r>
     </w:p>
     <w:p>
@@ -6900,14 +6670,7 @@
           <w:rFonts w:ascii="Courier New" w:eastAsia="Courier New" w:hAnsi="Courier New" w:cs="Courier New"/>
           <w:shd w:val="clear" w:color="auto" w:fill="E9EEF2"/>
         </w:rPr>
-        <w:t>auth.login_fail</w:t>
-      </w:r>
-      <w:r>
-        <w:rPr>
-          <w:rFonts w:ascii="Courier New" w:eastAsia="Courier New" w:hAnsi="Courier New" w:cs="Courier New"/>
-          <w:shd w:val="clear" w:color="auto" w:fill="E9EEF2"/>
-        </w:rPr>
-        <w:t>ed</w:t>
+        <w:t>auth.login_failed</w:t>
       </w:r>
       <w:proofErr w:type="spellEnd"/>
       <w:r>
@@ -7116,15 +6879,7 @@
           <w:sz w:val="18"/>
           <w:szCs w:val="18"/>
         </w:rPr>
-        <w:t>r</w:t>
-      </w:r>
-      <w:r>
-        <w:rPr>
-          <w:rFonts w:ascii="Courier New" w:eastAsia="Courier New" w:hAnsi="Courier New" w:cs="Courier New"/>
-          <w:sz w:val="18"/>
-          <w:szCs w:val="18"/>
-        </w:rPr>
-        <w:t>oles</w:t>
+        <w:t>roles</w:t>
       </w:r>
       <w:proofErr w:type="spellEnd"/>
       <w:r>
@@ -7340,10 +7095,7 @@
         <w:spacing w:before="260" w:after="140"/>
       </w:pPr>
       <w:r>
-        <w:t>7. Étape 6 - Sécurit</w:t>
-      </w:r>
-      <w:r>
-        <w:t>é minimale</w:t>
+        <w:t>7. Étape 6 - Sécurité minimale</w:t>
       </w:r>
     </w:p>
     <w:p>
@@ -7865,15 +7617,7 @@
           <w:sz w:val="18"/>
           <w:szCs w:val="18"/>
         </w:rPr>
-        <w:t>h</w:t>
-      </w:r>
-      <w:r>
-        <w:rPr>
-          <w:rFonts w:ascii="Courier New" w:eastAsia="Courier New" w:hAnsi="Courier New" w:cs="Courier New"/>
-          <w:sz w:val="18"/>
-          <w:szCs w:val="18"/>
-        </w:rPr>
-        <w:t>ex</w:t>
+        <w:t>hex</w:t>
       </w:r>
       <w:proofErr w:type="spellEnd"/>
       <w:r>
@@ -8140,10 +7884,7 @@
         <w:spacing w:after="130"/>
       </w:pPr>
       <w:r>
-        <w:t>ne pas préciser si un email existe lors d'un échec de connexion</w:t>
-      </w:r>
-      <w:r>
-        <w:t xml:space="preserve"> ;</w:t>
+        <w:t>ne pas préciser si un email existe lors d'un échec de connexion ;</w:t>
       </w:r>
     </w:p>
     <w:p>
@@ -8195,10 +7936,7 @@
         <w:spacing w:after="130"/>
       </w:pPr>
       <w:r>
-        <w:t>journaliser le d</w:t>
-      </w:r>
-      <w:r>
-        <w:t xml:space="preserve">étail côté serveur ou dans </w:t>
+        <w:t xml:space="preserve">journaliser le détail côté serveur ou dans </w:t>
       </w:r>
       <w:proofErr w:type="spellStart"/>
       <w:r>
@@ -8410,10 +8148,7 @@
       </w:r>
       <w:proofErr w:type="spellEnd"/>
       <w:r>
-        <w:t xml:space="preserve"> utilisateur permettent d'accorder </w:t>
-      </w:r>
-      <w:r>
-        <w:t>ou retirer un droit à une personne précise.</w:t>
+        <w:t xml:space="preserve"> utilisateur permettent d'accorder ou retirer un droit à une personne précise.</w:t>
       </w:r>
     </w:p>
     <w:p>
@@ -8762,10 +8497,7 @@
           </w:tcPr>
           <w:p>
             <w:r>
-              <w:t>Création d</w:t>
-            </w:r>
-            <w:r>
-              <w:t>'invitations</w:t>
+              <w:t>Création d'invitations</w:t>
             </w:r>
           </w:p>
         </w:tc>
@@ -9196,15 +8928,7 @@
           <w:sz w:val="18"/>
           <w:szCs w:val="18"/>
         </w:rPr>
-        <w:t>req.permissions</w:t>
-      </w:r>
-      <w:r>
-        <w:rPr>
-          <w:rFonts w:ascii="Courier New" w:eastAsia="Courier New" w:hAnsi="Courier New" w:cs="Courier New"/>
-          <w:sz w:val="18"/>
-          <w:szCs w:val="18"/>
-        </w:rPr>
-        <w:t>?.has</w:t>
+        <w:t>req.permissions?.has</w:t>
       </w:r>
       <w:proofErr w:type="spellEnd"/>
       <w:r>
@@ -9454,10 +9178,7 @@
       </w:r>
       <w:proofErr w:type="spellStart"/>
       <w:r>
-        <w:t>B</w:t>
-      </w:r>
-      <w:r>
-        <w:t>ootstrap</w:t>
+        <w:t>Bootstrap</w:t>
       </w:r>
       <w:proofErr w:type="spellEnd"/>
       <w:r>
@@ -9637,15 +9358,7 @@
           <w:sz w:val="18"/>
           <w:szCs w:val="18"/>
         </w:rPr>
-        <w:t>/inv</w:t>
-      </w:r>
-      <w:r>
-        <w:rPr>
-          <w:rFonts w:ascii="Courier New" w:eastAsia="Courier New" w:hAnsi="Courier New" w:cs="Courier New"/>
-          <w:sz w:val="18"/>
-          <w:szCs w:val="18"/>
-        </w:rPr>
-        <w:t>itations/</w:t>
+        <w:t>/invitations/</w:t>
       </w:r>
       <w:proofErr w:type="spellStart"/>
       <w:r>
@@ -10048,10 +9761,7 @@
         <w:spacing w:after="130"/>
       </w:pPr>
       <w:r>
-        <w:t>Les clés s</w:t>
-      </w:r>
-      <w:r>
-        <w:t xml:space="preserve">uivantes devront être ajoutées progressivement dans </w:t>
+        <w:t xml:space="preserve">Les clés suivantes devront être ajoutées progressivement dans </w:t>
       </w:r>
       <w:r>
         <w:rPr>
@@ -10725,10 +10435,7 @@
         <w:spacing w:after="130"/>
       </w:pPr>
       <w:r>
-        <w:t>bouton "Créer l'</w:t>
-      </w:r>
-      <w:r>
-        <w:t>invitation".</w:t>
+        <w:t>bouton "Créer l'invitation".</w:t>
       </w:r>
     </w:p>
     <w:p>
@@ -10861,10 +10568,7 @@
         <w:spacing w:after="130"/>
       </w:pPr>
       <w:r>
-        <w:t>message sobre lorsqu'</w:t>
-      </w:r>
-      <w:r>
-        <w:t>un email invité déclenche l'envoi du lien d'activation ;</w:t>
+        <w:t>message sobre lorsqu'un email invité déclenche l'envoi du lien d'activation ;</w:t>
       </w:r>
     </w:p>
     <w:p>
@@ -10928,14 +10632,7 @@
           <w:rFonts w:ascii="Courier New" w:eastAsia="Courier New" w:hAnsi="Courier New" w:cs="Courier New"/>
           <w:shd w:val="clear" w:color="auto" w:fill="E9EEF2"/>
         </w:rPr>
-        <w:t>Paramétrage</w:t>
-      </w:r>
-      <w:r>
-        <w:rPr>
-          <w:rFonts w:ascii="Courier New" w:eastAsia="Courier New" w:hAnsi="Courier New" w:cs="Courier New"/>
-          <w:shd w:val="clear" w:color="auto" w:fill="E9EEF2"/>
-        </w:rPr>
-        <w:t>s &gt; Utilisateurs &gt; Invitations</w:t>
+        <w:t>Paramétrages &gt; Utilisateurs &gt; Invitations</w:t>
       </w:r>
       <w:r>
         <w:t>.</w:t>
@@ -11056,10 +10753,7 @@
         <w:spacing w:before="260" w:after="140"/>
       </w:pPr>
       <w:r>
-        <w:t>10.2. Demand</w:t>
-      </w:r>
-      <w:r>
-        <w:t>e de lien depuis la page de connexion</w:t>
+        <w:t>10.2. Demande de lien depuis la page de connexion</w:t>
       </w:r>
     </w:p>
     <w:p>
@@ -11144,10 +10838,7 @@
         <w:spacing w:after="130"/>
       </w:pPr>
       <w:r>
-        <w:t>Vérifier que G2M affiche un message sobre indiquant que les instructions seront envoyées si l'adre</w:t>
-      </w:r>
-      <w:r>
-        <w:t>sse est autorisée.</w:t>
+        <w:t>Vérifier que G2M affiche un message sobre indiquant que les instructions seront envoyées si l'adresse est autorisée.</w:t>
       </w:r>
     </w:p>
     <w:p>
@@ -11613,10 +11304,7 @@
       </w:r>
       <w:proofErr w:type="spellEnd"/>
       <w:r>
-        <w:t xml:space="preserve"> ex</w:t>
-      </w:r>
-      <w:r>
-        <w:t>piré ou déjà utilisé</w:t>
+        <w:t xml:space="preserve"> expiré ou déjà utilisé</w:t>
       </w:r>
     </w:p>
     <w:p>
@@ -11870,10 +11558,7 @@
         <w:spacing w:before="260" w:after="140"/>
       </w:pPr>
       <w:r>
-        <w:t xml:space="preserve">Lot 2 - </w:t>
-      </w:r>
-      <w:r>
-        <w:t>Invitations administrateur</w:t>
+        <w:t>Lot 2 - Invitations administrateur</w:t>
       </w:r>
     </w:p>
     <w:p>
@@ -12113,14 +11798,7 @@
           <w:rFonts w:ascii="Courier New" w:eastAsia="Courier New" w:hAnsi="Courier New" w:cs="Courier New"/>
           <w:shd w:val="clear" w:color="auto" w:fill="E9EEF2"/>
         </w:rPr>
-        <w:t>e</w:t>
-      </w:r>
-      <w:r>
-        <w:rPr>
-          <w:rFonts w:ascii="Courier New" w:eastAsia="Courier New" w:hAnsi="Courier New" w:cs="Courier New"/>
-          <w:shd w:val="clear" w:color="auto" w:fill="E9EEF2"/>
-        </w:rPr>
-        <w:t>s.json</w:t>
+        <w:t>es.json</w:t>
       </w:r>
       <w:proofErr w:type="spellEnd"/>
     </w:p>
@@ -12385,14 +12063,7 @@
           <w:rFonts w:ascii="Courier New" w:eastAsia="Courier New" w:hAnsi="Courier New" w:cs="Courier New"/>
           <w:shd w:val="clear" w:color="auto" w:fill="E9EEF2"/>
         </w:rPr>
-        <w:t>midd</w:t>
-      </w:r>
-      <w:r>
-        <w:rPr>
-          <w:rFonts w:ascii="Courier New" w:eastAsia="Courier New" w:hAnsi="Courier New" w:cs="Courier New"/>
-          <w:shd w:val="clear" w:color="auto" w:fill="E9EEF2"/>
-        </w:rPr>
-        <w:t>lewares/authMiddleware.js</w:t>
+        <w:t>middlewares/authMiddleware.js</w:t>
       </w:r>
     </w:p>
     <w:p>
@@ -12507,10 +12178,7 @@
         <w:spacing w:after="130"/>
       </w:pPr>
       <w:r>
-        <w:t>Le contrôleur de connexion devra aussi gérer le cas particulier des emails invités non activés : recherche de l'invitation, génératio</w:t>
-      </w:r>
-      <w:r>
-        <w:t xml:space="preserve">n ou réutilisation d'un </w:t>
+        <w:t xml:space="preserve">Le contrôleur de connexion devra aussi gérer le cas particulier des emails invités non activés : recherche de l'invitation, génération ou réutilisation d'un </w:t>
       </w:r>
       <w:proofErr w:type="spellStart"/>
       <w:r>
@@ -12621,14 +12289,7 @@
           <w:rFonts w:ascii="Courier New" w:eastAsia="Courier New" w:hAnsi="Courier New" w:cs="Courier New"/>
           <w:shd w:val="clear" w:color="auto" w:fill="E9EEF2"/>
         </w:rPr>
-        <w:t>/per</w:t>
-      </w:r>
-      <w:r>
-        <w:rPr>
-          <w:rFonts w:ascii="Courier New" w:eastAsia="Courier New" w:hAnsi="Courier New" w:cs="Courier New"/>
-          <w:shd w:val="clear" w:color="auto" w:fill="E9EEF2"/>
-        </w:rPr>
-        <w:t>missionController.js</w:t>
+        <w:t>/permissionController.js</w:t>
       </w:r>
     </w:p>
     <w:p>
@@ -13071,15 +12732,7 @@
           <w:sz w:val="18"/>
           <w:szCs w:val="18"/>
         </w:rPr>
-        <w:t>ve</w:t>
-      </w:r>
-      <w:r>
-        <w:rPr>
-          <w:rFonts w:ascii="Courier New" w:eastAsia="Courier New" w:hAnsi="Courier New" w:cs="Courier New"/>
-          <w:sz w:val="18"/>
-          <w:szCs w:val="18"/>
-        </w:rPr>
-        <w:t>rifyPassword</w:t>
+        <w:t>verifyPassword</w:t>
       </w:r>
       <w:proofErr w:type="spellEnd"/>
       <w:r>
@@ -13371,15 +13024,7 @@
           <w:sz w:val="18"/>
           <w:szCs w:val="18"/>
         </w:rPr>
-        <w:t>m</w:t>
-      </w:r>
-      <w:r>
-        <w:rPr>
-          <w:rFonts w:ascii="Courier New" w:eastAsia="Courier New" w:hAnsi="Courier New" w:cs="Courier New"/>
-          <w:sz w:val="18"/>
-          <w:szCs w:val="18"/>
-        </w:rPr>
-        <w:t>odule.exports</w:t>
+        <w:t>module.exports</w:t>
       </w:r>
       <w:proofErr w:type="spellEnd"/>
       <w:r>
@@ -13713,15 +13358,7 @@
           <w:sz w:val="18"/>
           <w:szCs w:val="18"/>
         </w:rPr>
-        <w:t>cons</w:t>
-      </w:r>
-      <w:r>
-        <w:rPr>
-          <w:rFonts w:ascii="Courier New" w:eastAsia="Courier New" w:hAnsi="Courier New" w:cs="Courier New"/>
-          <w:sz w:val="18"/>
-          <w:szCs w:val="18"/>
-        </w:rPr>
-        <w:t>t</w:t>
+        <w:t>const</w:t>
       </w:r>
       <w:proofErr w:type="spellEnd"/>
       <w:r>
@@ -14047,15 +13684,7 @@
           <w:sz w:val="18"/>
           <w:szCs w:val="18"/>
         </w:rPr>
-        <w:t>ActivationToken.findVali</w:t>
-      </w:r>
-      <w:r>
-        <w:rPr>
-          <w:rFonts w:ascii="Courier New" w:eastAsia="Courier New" w:hAnsi="Courier New" w:cs="Courier New"/>
-          <w:sz w:val="18"/>
-          <w:szCs w:val="18"/>
-        </w:rPr>
-        <w:t>dByHash</w:t>
+        <w:t>ActivationToken.findValidByHash</w:t>
       </w:r>
       <w:proofErr w:type="spellEnd"/>
       <w:r>
@@ -14271,15 +13900,7 @@
           <w:sz w:val="18"/>
           <w:szCs w:val="18"/>
         </w:rPr>
-        <w:t>req.b</w:t>
-      </w:r>
-      <w:r>
-        <w:rPr>
-          <w:rFonts w:ascii="Courier New" w:eastAsia="Courier New" w:hAnsi="Courier New" w:cs="Courier New"/>
-          <w:sz w:val="18"/>
-          <w:szCs w:val="18"/>
-        </w:rPr>
-        <w:t>ody.password.length</w:t>
+        <w:t>req.body.password.length</w:t>
       </w:r>
       <w:proofErr w:type="spellEnd"/>
       <w:r>
@@ -14486,15 +14107,7 @@
           <w:sz w:val="18"/>
           <w:szCs w:val="18"/>
         </w:rPr>
-        <w:t xml:space="preserve">);  </w:t>
-      </w:r>
-      <w:r>
-        <w:rPr>
-          <w:rFonts w:ascii="Courier New" w:eastAsia="Courier New" w:hAnsi="Courier New" w:cs="Courier New"/>
-          <w:sz w:val="18"/>
-          <w:szCs w:val="18"/>
-        </w:rPr>
-        <w:t xml:space="preserve"> </w:t>
+        <w:t xml:space="preserve">);   </w:t>
       </w:r>
       <w:proofErr w:type="spellStart"/>
       <w:r>
@@ -14981,15 +14594,7 @@
           <w:sz w:val="18"/>
           <w:szCs w:val="18"/>
         </w:rPr>
-        <w:t>co</w:t>
-      </w:r>
-      <w:r>
-        <w:rPr>
-          <w:rFonts w:ascii="Courier New" w:eastAsia="Courier New" w:hAnsi="Courier New" w:cs="Courier New"/>
-          <w:sz w:val="18"/>
-          <w:szCs w:val="18"/>
-        </w:rPr>
-        <w:t>nst</w:t>
+        <w:t>const</w:t>
       </w:r>
       <w:proofErr w:type="spellEnd"/>
       <w:r>
@@ -15297,15 +14902,7 @@
           <w:sz w:val="18"/>
           <w:szCs w:val="18"/>
         </w:rPr>
-        <w:t>auth.login.genericNoti</w:t>
-      </w:r>
-      <w:r>
-        <w:rPr>
-          <w:rFonts w:ascii="Courier New" w:eastAsia="Courier New" w:hAnsi="Courier New" w:cs="Courier New"/>
-          <w:sz w:val="18"/>
-          <w:szCs w:val="18"/>
-        </w:rPr>
-        <w:t>ce</w:t>
+        <w:t>auth.login.genericNotice</w:t>
       </w:r>
       <w:proofErr w:type="spellEnd"/>
       <w:r>
@@ -15458,15 +15055,7 @@
           <w:sz w:val="18"/>
           <w:szCs w:val="18"/>
         </w:rPr>
-        <w:t>/login", {       no</w:t>
-      </w:r>
-      <w:r>
-        <w:rPr>
-          <w:rFonts w:ascii="Courier New" w:eastAsia="Courier New" w:hAnsi="Courier New" w:cs="Courier New"/>
-          <w:sz w:val="18"/>
-          <w:szCs w:val="18"/>
-        </w:rPr>
-        <w:t xml:space="preserve">tice: </w:t>
+        <w:t xml:space="preserve">/login", {       notice: </w:t>
       </w:r>
       <w:proofErr w:type="spellStart"/>
       <w:r>
@@ -15709,15 +15298,7 @@
           <w:sz w:val="18"/>
           <w:szCs w:val="18"/>
         </w:rPr>
-        <w:t>user.pas</w:t>
-      </w:r>
-      <w:r>
-        <w:rPr>
-          <w:rFonts w:ascii="Courier New" w:eastAsia="Courier New" w:hAnsi="Courier New" w:cs="Courier New"/>
-          <w:sz w:val="18"/>
-          <w:szCs w:val="18"/>
-        </w:rPr>
-        <w:t>sword_hash</w:t>
+        <w:t>user.password_hash</w:t>
       </w:r>
       <w:proofErr w:type="spellEnd"/>
       <w:r>
@@ -15882,10 +15463,7 @@
       </w:r>
       <w:proofErr w:type="spellEnd"/>
       <w:r>
-        <w:t xml:space="preserve"> d'activat</w:t>
-      </w:r>
-      <w:r>
-        <w:t>ion dans les logs.</w:t>
+        <w:t xml:space="preserve"> d'activation dans les logs.</w:t>
       </w:r>
     </w:p>
     <w:p>
@@ -15968,10 +15546,7 @@
         <w:spacing w:after="130"/>
       </w:pPr>
       <w:r>
-        <w:t>Protéger les routes administrateur</w:t>
-      </w:r>
-      <w:r>
-        <w:t xml:space="preserve"> dès que l'authentification existe.</w:t>
+        <w:t>Protéger les routes administrateur dès que l'authentification existe.</w:t>
       </w:r>
     </w:p>
     <w:p>
@@ -16015,21 +15590,15 @@
       </w:pPr>
       <w:r>
         <w:lastRenderedPageBreak/>
-        <w:t xml:space="preserve">G2M dispose déjà d'une base utile pour la gestion administrative des </w:t>
-      </w:r>
-      <w:r>
-        <w:t>utilisateurs. Le besoin cible ne nécessite pas une réécriture complète du module, mais une extension structurée autour des invitations, de l'activation, de l'authentification et des habilitations.</w:t>
-      </w:r>
-    </w:p>
-    <w:p>
-      <w:pPr>
-        <w:spacing w:after="130"/>
-      </w:pPr>
-      <w:r>
-        <w:t>La stratégie recommandée est progressive : d'abord stabilis</w:t>
-      </w:r>
-      <w:r>
-        <w:t xml:space="preserve">er le modèle de données et les invitations, puis ajouter l'activation, ensuite la connexion, et enfin les permissions fines. Cette démarche limite les risques de régression tout en posant une architecture compatible avec </w:t>
+        <w:t>G2M dispose déjà d'une base utile pour la gestion administrative des utilisateurs. Le besoin cible ne nécessite pas une réécriture complète du module, mais une extension structurée autour des invitations, de l'activation, de l'authentification et des habilitations.</w:t>
+      </w:r>
+    </w:p>
+    <w:p>
+      <w:pPr>
+        <w:spacing w:after="130"/>
+      </w:pPr>
+      <w:r>
+        <w:t xml:space="preserve">La stratégie recommandée est progressive : d'abord stabiliser le modèle de données et les invitations, puis ajouter l'activation, ensuite la connexion, et enfin les permissions fines. Cette démarche limite les risques de régression tout en posant une architecture compatible avec </w:t>
       </w:r>
       <w:proofErr w:type="spellStart"/>
       <w:r>
@@ -16045,10 +15614,156 @@
       </w:r>
       <w:proofErr w:type="spellEnd"/>
       <w:r>
-        <w:t xml:space="preserve"> et les futures e</w:t>
-      </w:r>
-      <w:r>
-        <w:t>xigences de sécurité de production.</w:t>
+        <w:t xml:space="preserve"> et les futures exigences de sécurité de production.</w:t>
+      </w:r>
+    </w:p>
+    <w:p>
+      <w:pPr>
+        <w:spacing w:after="130"/>
+      </w:pPr>
+    </w:p>
+    <w:p>
+      <w:pPr>
+        <w:spacing w:after="130"/>
+      </w:pPr>
+      <w:r>
+        <w:t>NB : les paramètres de l’administrateur sont :</w:t>
+      </w:r>
+    </w:p>
+    <w:p>
+      <w:pPr>
+        <w:spacing w:after="130"/>
+        <w:rPr>
+          <w:i/>
+        </w:rPr>
+      </w:pPr>
+      <w:r>
+        <w:rPr>
+          <w:i/>
+        </w:rPr>
+        <w:t>Le compte administrateur local utilise maintenant :</w:t>
+      </w:r>
+    </w:p>
+    <w:p>
+      <w:pPr>
+        <w:spacing w:after="130"/>
+      </w:pPr>
+    </w:p>
+    <w:p>
+      <w:pPr>
+        <w:pStyle w:val="Paragraphedeliste"/>
+        <w:numPr>
+          <w:ilvl w:val="0"/>
+          <w:numId w:val="4"/>
+        </w:numPr>
+        <w:spacing w:after="130"/>
+      </w:pPr>
+      <w:r>
+        <w:rPr>
+          <w:b/>
+        </w:rPr>
+        <w:t>Email</w:t>
+      </w:r>
+      <w:r>
+        <w:t xml:space="preserve"> : operagis2022@gmail.com</w:t>
+      </w:r>
+    </w:p>
+    <w:p>
+      <w:pPr>
+        <w:pStyle w:val="Paragraphedeliste"/>
+        <w:numPr>
+          <w:ilvl w:val="0"/>
+          <w:numId w:val="4"/>
+        </w:numPr>
+        <w:spacing w:after="130"/>
+      </w:pPr>
+      <w:r>
+        <w:rPr>
+          <w:b/>
+        </w:rPr>
+        <w:t>Mot de passe</w:t>
+      </w:r>
+      <w:r>
+        <w:t xml:space="preserve"> : inchangé (</w:t>
+      </w:r>
+      <w:bookmarkStart w:id="0" w:name="_GoBack"/>
+      <w:r>
+        <w:t>Admin123456</w:t>
+      </w:r>
+      <w:bookmarkEnd w:id="0"/>
+      <w:r>
+        <w:t>)</w:t>
+      </w:r>
+    </w:p>
+    <w:p>
+      <w:pPr>
+        <w:pStyle w:val="Paragraphedeliste"/>
+        <w:numPr>
+          <w:ilvl w:val="0"/>
+          <w:numId w:val="4"/>
+        </w:numPr>
+        <w:spacing w:after="130"/>
+      </w:pPr>
+      <w:r>
+        <w:rPr>
+          <w:b/>
+        </w:rPr>
+        <w:t>Rôle</w:t>
+      </w:r>
+      <w:r>
+        <w:t xml:space="preserve"> : </w:t>
+      </w:r>
+      <w:proofErr w:type="spellStart"/>
+      <w:r>
+        <w:t>admin</w:t>
+      </w:r>
+      <w:proofErr w:type="spellEnd"/>
+    </w:p>
+    <w:p>
+      <w:pPr>
+        <w:pStyle w:val="Paragraphedeliste"/>
+        <w:numPr>
+          <w:ilvl w:val="0"/>
+          <w:numId w:val="4"/>
+        </w:numPr>
+        <w:spacing w:after="130"/>
+      </w:pPr>
+      <w:r>
+        <w:rPr>
+          <w:b/>
+        </w:rPr>
+        <w:t>Statut</w:t>
+      </w:r>
+      <w:r>
+        <w:t xml:space="preserve"> : actif</w:t>
+      </w:r>
+    </w:p>
+    <w:p>
+      <w:pPr>
+        <w:pStyle w:val="Paragraphedeliste"/>
+        <w:numPr>
+          <w:ilvl w:val="0"/>
+          <w:numId w:val="4"/>
+        </w:numPr>
+        <w:spacing w:after="130"/>
+      </w:pPr>
+      <w:r>
+        <w:rPr>
+          <w:b/>
+        </w:rPr>
+        <w:t>Email</w:t>
+      </w:r>
+      <w:r>
+        <w:t xml:space="preserve"> </w:t>
+      </w:r>
+      <w:r>
+        <w:rPr>
+          <w:b/>
+        </w:rPr>
+        <w:t>vérifié</w:t>
+      </w:r>
+      <w:r>
+        <w:t xml:space="preserve"> : oui</w:t>
       </w:r>
     </w:p>
     <w:sectPr>
@@ -16064,6 +15779,231 @@
 <file path=word/numbering.xml><?xml version="1.0" encoding="utf-8"?>
 <w:numbering xmlns:wpc="http://schemas.microsoft.com/office/word/2010/wordprocessingCanvas" xmlns:mc="http://schemas.openxmlformats.org/markup-compatibility/2006" xmlns:o="urn:schemas-microsoft-com:office:office" xmlns:r="http://schemas.openxmlformats.org/officeDocument/2006/relationships" xmlns:m="http://schemas.openxmlformats.org/officeDocument/2006/math" xmlns:v="urn:schemas-microsoft-com:vml" xmlns:wp14="http://schemas.microsoft.com/office/word/2010/wordprocessingDrawing" xmlns:wp="http://schemas.openxmlformats.org/drawingml/2006/wordprocessingDrawing" xmlns:w10="urn:schemas-microsoft-com:office:word" xmlns:w="http://schemas.openxmlformats.org/wordprocessingml/2006/main" xmlns:w14="http://schemas.microsoft.com/office/word/2010/wordml" xmlns:w15="http://schemas.microsoft.com/office/word/2012/wordml" xmlns:wpg="http://schemas.microsoft.com/office/word/2010/wordprocessingGroup" xmlns:wpi="http://schemas.microsoft.com/office/word/2010/wordprocessingInk" xmlns:wne="http://schemas.microsoft.com/office/word/2006/wordml" xmlns:wps="http://schemas.microsoft.com/office/word/2010/wordprocessingShape" mc:Ignorable="w14 w15 wp14">
   <w:abstractNum w:abstractNumId="0">
+    <w:nsid w:val="36E05DB7"/>
+    <w:multiLevelType w:val="hybridMultilevel"/>
+    <w:tmpl w:val="82E640C2"/>
+    <w:lvl w:ilvl="0" w:tplc="79DC65DE">
+      <w:numFmt w:val="bullet"/>
+      <w:lvlText w:val="-"/>
+      <w:lvlJc w:val="left"/>
+      <w:pPr>
+        <w:ind w:left="480" w:hanging="360"/>
+      </w:pPr>
+      <w:rPr>
+        <w:rFonts w:ascii="Arial" w:eastAsia="Arial" w:hAnsi="Arial" w:cs="Arial" w:hint="default"/>
+      </w:rPr>
+    </w:lvl>
+    <w:lvl w:ilvl="1" w:tplc="040C0003" w:tentative="1">
+      <w:start w:val="1"/>
+      <w:numFmt w:val="bullet"/>
+      <w:lvlText w:val="o"/>
+      <w:lvlJc w:val="left"/>
+      <w:pPr>
+        <w:ind w:left="1200" w:hanging="360"/>
+      </w:pPr>
+      <w:rPr>
+        <w:rFonts w:ascii="Courier New" w:hAnsi="Courier New" w:cs="Courier New" w:hint="default"/>
+      </w:rPr>
+    </w:lvl>
+    <w:lvl w:ilvl="2" w:tplc="040C0005" w:tentative="1">
+      <w:start w:val="1"/>
+      <w:numFmt w:val="bullet"/>
+      <w:lvlText w:val=""/>
+      <w:lvlJc w:val="left"/>
+      <w:pPr>
+        <w:ind w:left="1920" w:hanging="360"/>
+      </w:pPr>
+      <w:rPr>
+        <w:rFonts w:ascii="Wingdings" w:hAnsi="Wingdings" w:hint="default"/>
+      </w:rPr>
+    </w:lvl>
+    <w:lvl w:ilvl="3" w:tplc="040C0001" w:tentative="1">
+      <w:start w:val="1"/>
+      <w:numFmt w:val="bullet"/>
+      <w:lvlText w:val=""/>
+      <w:lvlJc w:val="left"/>
+      <w:pPr>
+        <w:ind w:left="2640" w:hanging="360"/>
+      </w:pPr>
+      <w:rPr>
+        <w:rFonts w:ascii="Symbol" w:hAnsi="Symbol" w:hint="default"/>
+      </w:rPr>
+    </w:lvl>
+    <w:lvl w:ilvl="4" w:tplc="040C0003" w:tentative="1">
+      <w:start w:val="1"/>
+      <w:numFmt w:val="bullet"/>
+      <w:lvlText w:val="o"/>
+      <w:lvlJc w:val="left"/>
+      <w:pPr>
+        <w:ind w:left="3360" w:hanging="360"/>
+      </w:pPr>
+      <w:rPr>
+        <w:rFonts w:ascii="Courier New" w:hAnsi="Courier New" w:cs="Courier New" w:hint="default"/>
+      </w:rPr>
+    </w:lvl>
+    <w:lvl w:ilvl="5" w:tplc="040C0005" w:tentative="1">
+      <w:start w:val="1"/>
+      <w:numFmt w:val="bullet"/>
+      <w:lvlText w:val=""/>
+      <w:lvlJc w:val="left"/>
+      <w:pPr>
+        <w:ind w:left="4080" w:hanging="360"/>
+      </w:pPr>
+      <w:rPr>
+        <w:rFonts w:ascii="Wingdings" w:hAnsi="Wingdings" w:hint="default"/>
+      </w:rPr>
+    </w:lvl>
+    <w:lvl w:ilvl="6" w:tplc="040C0001" w:tentative="1">
+      <w:start w:val="1"/>
+      <w:numFmt w:val="bullet"/>
+      <w:lvlText w:val=""/>
+      <w:lvlJc w:val="left"/>
+      <w:pPr>
+        <w:ind w:left="4800" w:hanging="360"/>
+      </w:pPr>
+      <w:rPr>
+        <w:rFonts w:ascii="Symbol" w:hAnsi="Symbol" w:hint="default"/>
+      </w:rPr>
+    </w:lvl>
+    <w:lvl w:ilvl="7" w:tplc="040C0003" w:tentative="1">
+      <w:start w:val="1"/>
+      <w:numFmt w:val="bullet"/>
+      <w:lvlText w:val="o"/>
+      <w:lvlJc w:val="left"/>
+      <w:pPr>
+        <w:ind w:left="5520" w:hanging="360"/>
+      </w:pPr>
+      <w:rPr>
+        <w:rFonts w:ascii="Courier New" w:hAnsi="Courier New" w:cs="Courier New" w:hint="default"/>
+      </w:rPr>
+    </w:lvl>
+    <w:lvl w:ilvl="8" w:tplc="040C0005" w:tentative="1">
+      <w:start w:val="1"/>
+      <w:numFmt w:val="bullet"/>
+      <w:lvlText w:val=""/>
+      <w:lvlJc w:val="left"/>
+      <w:pPr>
+        <w:ind w:left="6240" w:hanging="360"/>
+      </w:pPr>
+      <w:rPr>
+        <w:rFonts w:ascii="Wingdings" w:hAnsi="Wingdings" w:hint="default"/>
+      </w:rPr>
+    </w:lvl>
+  </w:abstractNum>
+  <w:abstractNum w:abstractNumId="1">
+    <w:nsid w:val="4E0B519B"/>
+    <w:multiLevelType w:val="hybridMultilevel"/>
+    <w:tmpl w:val="FDE84292"/>
+    <w:lvl w:ilvl="0" w:tplc="040C0001">
+      <w:start w:val="1"/>
+      <w:numFmt w:val="bullet"/>
+      <w:lvlText w:val=""/>
+      <w:lvlJc w:val="left"/>
+      <w:pPr>
+        <w:ind w:left="720" w:hanging="360"/>
+      </w:pPr>
+      <w:rPr>
+        <w:rFonts w:ascii="Symbol" w:hAnsi="Symbol" w:hint="default"/>
+      </w:rPr>
+    </w:lvl>
+    <w:lvl w:ilvl="1" w:tplc="040C0003" w:tentative="1">
+      <w:start w:val="1"/>
+      <w:numFmt w:val="bullet"/>
+      <w:lvlText w:val="o"/>
+      <w:lvlJc w:val="left"/>
+      <w:pPr>
+        <w:ind w:left="1440" w:hanging="360"/>
+      </w:pPr>
+      <w:rPr>
+        <w:rFonts w:ascii="Courier New" w:hAnsi="Courier New" w:cs="Courier New" w:hint="default"/>
+      </w:rPr>
+    </w:lvl>
+    <w:lvl w:ilvl="2" w:tplc="040C0005" w:tentative="1">
+      <w:start w:val="1"/>
+      <w:numFmt w:val="bullet"/>
+      <w:lvlText w:val=""/>
+      <w:lvlJc w:val="left"/>
+      <w:pPr>
+        <w:ind w:left="2160" w:hanging="360"/>
+      </w:pPr>
+      <w:rPr>
+        <w:rFonts w:ascii="Wingdings" w:hAnsi="Wingdings" w:hint="default"/>
+      </w:rPr>
+    </w:lvl>
+    <w:lvl w:ilvl="3" w:tplc="040C0001" w:tentative="1">
+      <w:start w:val="1"/>
+      <w:numFmt w:val="bullet"/>
+      <w:lvlText w:val=""/>
+      <w:lvlJc w:val="left"/>
+      <w:pPr>
+        <w:ind w:left="2880" w:hanging="360"/>
+      </w:pPr>
+      <w:rPr>
+        <w:rFonts w:ascii="Symbol" w:hAnsi="Symbol" w:hint="default"/>
+      </w:rPr>
+    </w:lvl>
+    <w:lvl w:ilvl="4" w:tplc="040C0003" w:tentative="1">
+      <w:start w:val="1"/>
+      <w:numFmt w:val="bullet"/>
+      <w:lvlText w:val="o"/>
+      <w:lvlJc w:val="left"/>
+      <w:pPr>
+        <w:ind w:left="3600" w:hanging="360"/>
+      </w:pPr>
+      <w:rPr>
+        <w:rFonts w:ascii="Courier New" w:hAnsi="Courier New" w:cs="Courier New" w:hint="default"/>
+      </w:rPr>
+    </w:lvl>
+    <w:lvl w:ilvl="5" w:tplc="040C0005" w:tentative="1">
+      <w:start w:val="1"/>
+      <w:numFmt w:val="bullet"/>
+      <w:lvlText w:val=""/>
+      <w:lvlJc w:val="left"/>
+      <w:pPr>
+        <w:ind w:left="4320" w:hanging="360"/>
+      </w:pPr>
+      <w:rPr>
+        <w:rFonts w:ascii="Wingdings" w:hAnsi="Wingdings" w:hint="default"/>
+      </w:rPr>
+    </w:lvl>
+    <w:lvl w:ilvl="6" w:tplc="040C0001" w:tentative="1">
+      <w:start w:val="1"/>
+      <w:numFmt w:val="bullet"/>
+      <w:lvlText w:val=""/>
+      <w:lvlJc w:val="left"/>
+      <w:pPr>
+        <w:ind w:left="5040" w:hanging="360"/>
+      </w:pPr>
+      <w:rPr>
+        <w:rFonts w:ascii="Symbol" w:hAnsi="Symbol" w:hint="default"/>
+      </w:rPr>
+    </w:lvl>
+    <w:lvl w:ilvl="7" w:tplc="040C0003" w:tentative="1">
+      <w:start w:val="1"/>
+      <w:numFmt w:val="bullet"/>
+      <w:lvlText w:val="o"/>
+      <w:lvlJc w:val="left"/>
+      <w:pPr>
+        <w:ind w:left="5760" w:hanging="360"/>
+      </w:pPr>
+      <w:rPr>
+        <w:rFonts w:ascii="Courier New" w:hAnsi="Courier New" w:cs="Courier New" w:hint="default"/>
+      </w:rPr>
+    </w:lvl>
+    <w:lvl w:ilvl="8" w:tplc="040C0005" w:tentative="1">
+      <w:start w:val="1"/>
+      <w:numFmt w:val="bullet"/>
+      <w:lvlText w:val=""/>
+      <w:lvlJc w:val="left"/>
+      <w:pPr>
+        <w:ind w:left="6480" w:hanging="360"/>
+      </w:pPr>
+      <w:rPr>
+        <w:rFonts w:ascii="Wingdings" w:hAnsi="Wingdings" w:hint="default"/>
+      </w:rPr>
+    </w:lvl>
+  </w:abstractNum>
+  <w:abstractNum w:abstractNumId="2">
     <w:nsid w:val="5C502DCA"/>
     <w:multiLevelType w:val="hybridMultilevel"/>
     <w:tmpl w:val="9B40641A"/>
@@ -16117,7 +16057,7 @@
       <w:lvlJc w:val="left"/>
     </w:lvl>
   </w:abstractNum>
-  <w:abstractNum w:abstractNumId="1">
+  <w:abstractNum w:abstractNumId="3">
     <w:nsid w:val="6D3F5C61"/>
     <w:multiLevelType w:val="hybridMultilevel"/>
     <w:tmpl w:val="9F506636"/>
@@ -16204,16 +16144,22 @@
     </w:lvl>
   </w:abstractNum>
   <w:num w:numId="1">
-    <w:abstractNumId w:val="1"/>
+    <w:abstractNumId w:val="3"/>
     <w:lvlOverride w:ilvl="0">
       <w:startOverride w:val="1"/>
     </w:lvlOverride>
   </w:num>
   <w:num w:numId="2">
-    <w:abstractNumId w:val="0"/>
+    <w:abstractNumId w:val="2"/>
     <w:lvlOverride w:ilvl="0">
       <w:startOverride w:val="1"/>
     </w:lvlOverride>
+  </w:num>
+  <w:num w:numId="3">
+    <w:abstractNumId w:val="1"/>
+  </w:num>
+  <w:num w:numId="4">
+    <w:abstractNumId w:val="0"/>
   </w:num>
 </w:numbering>
 </file>

</xml_diff>